<commit_message>
feat: enable active clickable hyperlinks for Email, Phone, LinkedIn, GitHub, and Portfolio across all PDF, DOCX, and Markdown resumes
</commit_message>
<xml_diff>
--- a/output/en/Muhamad_Hendri_Febriansyah_Resume.docx
+++ b/output/en/Muhamad_Hendri_Febriansyah_Resume.docx
@@ -28,8 +28,93 @@
           <w:color w:val="475569"/>
           <w:sz w:val="18"/>
         </w:rPr>
-        <w:t>Surabaya / Jakarta, Indonesia  •  hendrifebriansyah28@gmail.com  •  +62 896 9827 7267  •  LinkedIn: linkedin.com/in/hendrifebriansyah  •  GitHub: github.com/hendrifebriansyah  •  Portfolio: Portfolio</w:t>
+        <w:t xml:space="preserve">Surabaya / Jakarta, Indonesia  •  </w:t>
       </w:r>
+      <w:hyperlink r:id="rId9" w:history="1">
+        <w:r>
+          <w:rPr>
+            <w:rFonts w:ascii="Calibri" w:hAnsi="Calibri"/>
+            <w:sz w:val="18"/>
+            <w:color w:val="2563EB"/>
+          </w:rPr>
+          <w:t xml:space="preserve">hendrifebriansyah28@gmail.com</w:t>
+        </w:r>
+      </w:hyperlink>
+      <w:r>
+        <w:rPr>
+          <w:rFonts w:ascii="Calibri" w:hAnsi="Calibri"/>
+          <w:color w:val="475569"/>
+          <w:sz w:val="18"/>
+        </w:rPr>
+        <w:t xml:space="preserve">  •  </w:t>
+      </w:r>
+      <w:hyperlink r:id="rId10" w:history="1">
+        <w:r>
+          <w:rPr>
+            <w:rFonts w:ascii="Calibri" w:hAnsi="Calibri"/>
+            <w:sz w:val="18"/>
+            <w:color w:val="2563EB"/>
+          </w:rPr>
+          <w:t xml:space="preserve">+62 896 9827 7267</w:t>
+        </w:r>
+      </w:hyperlink>
+      <w:r>
+        <w:rPr>
+          <w:rFonts w:ascii="Calibri" w:hAnsi="Calibri"/>
+          <w:color w:val="475569"/>
+          <w:sz w:val="18"/>
+        </w:rPr>
+        <w:t xml:space="preserve">  •  </w:t>
+      </w:r>
+      <w:hyperlink r:id="rId11" w:history="1">
+        <w:r>
+          <w:rPr>
+            <w:rFonts w:ascii="Calibri" w:hAnsi="Calibri"/>
+            <w:sz w:val="18"/>
+            <w:color w:val="2563EB"/>
+            <w:u w:val="single"/>
+          </w:rPr>
+          <w:t xml:space="preserve">LinkedIn</w:t>
+        </w:r>
+      </w:hyperlink>
+      <w:r>
+        <w:rPr>
+          <w:rFonts w:ascii="Calibri" w:hAnsi="Calibri"/>
+          <w:color w:val="475569"/>
+          <w:sz w:val="18"/>
+        </w:rPr>
+        <w:t xml:space="preserve">  •  </w:t>
+      </w:r>
+      <w:hyperlink r:id="rId12" w:history="1">
+        <w:r>
+          <w:rPr>
+            <w:rFonts w:ascii="Calibri" w:hAnsi="Calibri"/>
+            <w:sz w:val="18"/>
+            <w:color w:val="2563EB"/>
+            <w:u w:val="single"/>
+          </w:rPr>
+          <w:t xml:space="preserve">GitHub</w:t>
+        </w:r>
+      </w:hyperlink>
+      <w:r>
+        <w:rPr>
+          <w:rFonts w:ascii="Calibri" w:hAnsi="Calibri"/>
+          <w:color w:val="475569"/>
+          <w:sz w:val="18"/>
+        </w:rPr>
+        <w:t xml:space="preserve">  •  </w:t>
+      </w:r>
+      <w:hyperlink r:id="rId13" w:history="1">
+        <w:r>
+          <w:rPr>
+            <w:rFonts w:ascii="Calibri" w:hAnsi="Calibri"/>
+            <w:sz w:val="18"/>
+            <w:color w:val="2563EB"/>
+            <w:u w:val="single"/>
+          </w:rPr>
+          <w:t xml:space="preserve">Portfolio &amp; Career Graph</w:t>
+        </w:r>
+      </w:hyperlink>
     </w:p>
     <w:p>
       <w:pPr>

</xml_diff>